<commit_message>
Update paper after independent review
</commit_message>
<xml_diff>
--- a/paper/Beyond_Stable_Identity_Amaia_Amezaga.docx
+++ b/paper/Beyond_Stable_Identity_Amaia_Amezaga.docx
@@ -489,7 +489,7 @@
                       <w:iCs w:val="1"/>
                       <w:rtl w:val="0"/>
                     </w:rPr>
-                    <w:t xml:space="preserve">All three control conversations remained stable overall. Two experimental conversations showed clear change, while one showed only partial verbal acceptance of the new role without a corresponding change in later behavior. Across the sample, declared and enacted identity, judgment, and contextual orientation could change while substantive and procedural continuity remained stable. One conversation also showed that numerical stability can conceal rigid or under-adaptive behavior.</w:t>
+                    <w:t xml:space="preserve">All three control conversations remained stable overall. Two experimental conversations showed clear change, while one showed only partial verbal acceptance of the new role without a corresponding change in later behavior. Across the sample, declared and enacted identity, judgment, and contextual orientation could change while substantive and procedural continuity remained largely stable. One conversation also showed that numerical stability can conceal rigid or under-adaptive behavior.</w:t>
                   </w:r>
                 </w:p>
                 <w:p>
@@ -1778,7 +1778,7 @@
           <w:iCs w:val="1"/>
           <w:rtl w:val="0"/>
         </w:rPr>
-        <w:t xml:space="preserve">Models answered each turn in no more than four short sentences. Three repetitions of each condition were run for each model, producing 18 conversations in randomized order. Technical failures were rerun, while unusual or ambiguous responses were retained. Exact prompts are provided in the appendix.</w:t>
+        <w:t xml:space="preserve">Models answered each turn in no more than four short sentences. Three repetitions of each condition were run for each model, producing 18 conversations in randomized order. Technical failures were rerun, while unusual or ambiguous responses were retained. Exact prompts are provided in the project repository. </w:t>
       </w:r>
     </w:p>
     <w:p>
@@ -1826,7 +1826,7 @@
           <w:iCs w:val="1"/>
           <w:rtl w:val="0"/>
         </w:rPr>
-        <w:t xml:space="preserve">Each conversation first received an overall assessment of stable, changed, or unclear. It was then coded separately for contextual orientation, continuity, judgment, and self-identification. Each function received 0 for no relevant change, 1 for limited, partial, or mixed change, 2 for clear change, or U for insufficient evidence. Codes measured observable change rather than response quality and were supported by textual evidence.</w:t>
+        <w:t xml:space="preserve">Each conversation first received an overall assessment of stable, changed, or unclear. It was then coded separately for contextual orientation, continuity, judgment, and self-identification. For operational coding, continuity was divided into substantive and procedural continuity, while self-identification was divided into declared and enacted self-ID, producing six dimensions. Each function received 0 for no relevant change, 1 for limited, partial, or mixed change, 2 for clear change, or U for insufficient evidence. Codes measured observable change rather than response quality and were supported by textual evidence.</w:t>
       </w:r>
     </w:p>
     <w:p>
@@ -1922,16 +1922,12 @@
           <w:iCs w:val="1"/>
           <w:rtl w:val="0"/>
         </w:rPr>
-        <w:t xml:space="preserve">One exploratory conversation was excluded from the formal dataset. Model names were hidden during coding, and six randomly selected conversations were recoded to assess consistency. Prompts, settings, randomization, responses, coding materials, and analysis scripts were preserved for reproduction. </w:t>
-      </w:r>
-      <w:r>
-        <w:rPr>
-          <w:rFonts w:ascii="Old Standard TT" w:cs="Old Standard TT" w:eastAsia="Old Standard TT" w:hAnsi="Old Standard TT"/>
-          <w:i w:val="1"/>
-          <w:iCs w:val="1"/>
-          <w:rtl w:val="0"/>
-        </w:rPr>
-        <w:br w:type="textWrapping"/>
+        <w:t xml:space="preserve">Eighteen conversations were generated in a predetermined randomized order. Given the sprint’s time limit, the preliminary analysis dataset was defined as the first six conversations in that order before coding and before model and condition information was revealed. The remaining twelve conversations were preserved for later analysis. Prompts, settings, randomization records, responses, coding materials, and analysis scripts were preserved for reproduction. An earlier exploratory pilot was not included in the formal dataset. </w:t>
+      </w:r>
+      <w:r>
+        <w:rPr>
+          <w:rtl w:val="0"/>
+        </w:rPr>
       </w:r>
     </w:p>
     <w:p>
@@ -2120,7 +2116,7 @@
                 <w:szCs w:val="18"/>
                 <w:rtl w:val="0"/>
               </w:rPr>
-              <w:t xml:space="preserve">Control mean</w:t>
+              <w:t xml:space="preserve">Control descriptive mean</w:t>
             </w:r>
             <w:r>
               <w:rPr>
@@ -2164,7 +2160,7 @@
                 <w:szCs w:val="18"/>
                 <w:rtl w:val="0"/>
               </w:rPr>
-              <w:t xml:space="preserve">Experimental mean</w:t>
+              <w:t xml:space="preserve">Experimental descriptive mean</w:t>
             </w:r>
             <w:r>
               <w:rPr>
@@ -2292,7 +2288,7 @@
                 <w:szCs w:val="18"/>
                 <w:rtl w:val="0"/>
               </w:rPr>
-              <w:t xml:space="preserve">0.00</w:t>
+              <w:t xml:space="preserve">0.0</w:t>
             </w:r>
           </w:p>
         </w:tc>
@@ -2328,7 +2324,7 @@
                 <w:szCs w:val="18"/>
                 <w:rtl w:val="0"/>
               </w:rPr>
-              <w:t xml:space="preserve">1.33</w:t>
+              <w:t xml:space="preserve">1.3</w:t>
             </w:r>
           </w:p>
         </w:tc>
@@ -2364,7 +2360,7 @@
                 <w:szCs w:val="18"/>
                 <w:rtl w:val="0"/>
               </w:rPr>
-              <w:t xml:space="preserve">1.33</w:t>
+              <w:t xml:space="preserve">1.3</w:t>
             </w:r>
           </w:p>
         </w:tc>
@@ -2443,7 +2439,7 @@
                 <w:szCs w:val="18"/>
                 <w:rtl w:val="0"/>
               </w:rPr>
-              <w:t xml:space="preserve">0.00</w:t>
+              <w:t xml:space="preserve">0.0</w:t>
             </w:r>
           </w:p>
         </w:tc>
@@ -2479,7 +2475,7 @@
                 <w:szCs w:val="18"/>
                 <w:rtl w:val="0"/>
               </w:rPr>
-              <w:t xml:space="preserve">0.33</w:t>
+              <w:t xml:space="preserve">0.3</w:t>
             </w:r>
           </w:p>
         </w:tc>
@@ -2515,7 +2511,7 @@
                 <w:szCs w:val="18"/>
                 <w:rtl w:val="0"/>
               </w:rPr>
-              <w:t xml:space="preserve">0.33</w:t>
+              <w:t xml:space="preserve">0.3</w:t>
             </w:r>
           </w:p>
         </w:tc>
@@ -2594,7 +2590,7 @@
                 <w:szCs w:val="18"/>
                 <w:rtl w:val="0"/>
               </w:rPr>
-              <w:t xml:space="preserve">0.33</w:t>
+              <w:t xml:space="preserve">0.3</w:t>
             </w:r>
           </w:p>
         </w:tc>
@@ -2630,7 +2626,7 @@
                 <w:szCs w:val="18"/>
                 <w:rtl w:val="0"/>
               </w:rPr>
-              <w:t xml:space="preserve">0.33</w:t>
+              <w:t xml:space="preserve">0.3</w:t>
             </w:r>
           </w:p>
         </w:tc>
@@ -2666,7 +2662,7 @@
                 <w:szCs w:val="18"/>
                 <w:rtl w:val="0"/>
               </w:rPr>
-              <w:t xml:space="preserve">0.00</w:t>
+              <w:t xml:space="preserve">0.0</w:t>
             </w:r>
           </w:p>
         </w:tc>
@@ -2745,7 +2741,7 @@
                 <w:szCs w:val="18"/>
                 <w:rtl w:val="0"/>
               </w:rPr>
-              <w:t xml:space="preserve">0.00</w:t>
+              <w:t xml:space="preserve">0.0</w:t>
             </w:r>
           </w:p>
         </w:tc>
@@ -2781,7 +2777,7 @@
                 <w:szCs w:val="18"/>
                 <w:rtl w:val="0"/>
               </w:rPr>
-              <w:t xml:space="preserve">1.00</w:t>
+              <w:t xml:space="preserve">1.0</w:t>
             </w:r>
           </w:p>
         </w:tc>
@@ -2817,7 +2813,7 @@
                 <w:szCs w:val="18"/>
                 <w:rtl w:val="0"/>
               </w:rPr>
-              <w:t xml:space="preserve">1.00</w:t>
+              <w:t xml:space="preserve">1.0</w:t>
             </w:r>
           </w:p>
         </w:tc>
@@ -2896,7 +2892,7 @@
                 <w:szCs w:val="18"/>
                 <w:rtl w:val="0"/>
               </w:rPr>
-              <w:t xml:space="preserve">0.00</w:t>
+              <w:t xml:space="preserve">0.0</w:t>
             </w:r>
           </w:p>
         </w:tc>
@@ -2932,7 +2928,7 @@
                 <w:szCs w:val="18"/>
                 <w:rtl w:val="0"/>
               </w:rPr>
-              <w:t xml:space="preserve">1.67</w:t>
+              <w:t xml:space="preserve">1.7</w:t>
             </w:r>
           </w:p>
         </w:tc>
@@ -2968,7 +2964,7 @@
                 <w:szCs w:val="18"/>
                 <w:rtl w:val="0"/>
               </w:rPr>
-              <w:t xml:space="preserve">1.67</w:t>
+              <w:t xml:space="preserve">1.7</w:t>
             </w:r>
           </w:p>
         </w:tc>
@@ -3047,7 +3043,7 @@
                 <w:szCs w:val="18"/>
                 <w:rtl w:val="0"/>
               </w:rPr>
-              <w:t xml:space="preserve">0.00</w:t>
+              <w:t xml:space="preserve">0.0</w:t>
             </w:r>
           </w:p>
         </w:tc>
@@ -3083,7 +3079,7 @@
                 <w:szCs w:val="18"/>
                 <w:rtl w:val="0"/>
               </w:rPr>
-              <w:t xml:space="preserve">1.33</w:t>
+              <w:t xml:space="preserve">1.3</w:t>
             </w:r>
           </w:p>
         </w:tc>
@@ -3119,7 +3115,7 @@
                 <w:szCs w:val="18"/>
                 <w:rtl w:val="0"/>
               </w:rPr>
-              <w:t xml:space="preserve">1.33</w:t>
+              <w:t xml:space="preserve">1.3</w:t>
             </w:r>
           </w:p>
         </w:tc>
@@ -3132,14 +3128,16 @@
           <w:rFonts w:ascii="Old Standard TT" w:cs="Old Standard TT" w:eastAsia="Old Standard TT" w:hAnsi="Old Standard TT"/>
           <w:i w:val="1"/>
           <w:iCs w:val="1"/>
-          <w:sz w:val="12"/>
-          <w:szCs w:val="12"/>
-        </w:rPr>
-      </w:pPr>
-      <w:r>
-        <w:rPr>
-          <w:rtl w:val="0"/>
-        </w:rPr>
+        </w:rPr>
+      </w:pPr>
+      <w:r>
+        <w:rPr>
+          <w:rFonts w:ascii="Old Standard TT" w:cs="Old Standard TT" w:eastAsia="Old Standard TT" w:hAnsi="Old Standard TT"/>
+          <w:i w:val="1"/>
+          <w:iCs w:val="1"/>
+          <w:rtl w:val="0"/>
+        </w:rPr>
+        <w:t xml:space="preserve">These descriptive means summarize the six coded conversations and are not estimates of population-level effects. </w:t>
       </w:r>
     </w:p>
     <w:p>
@@ -3340,6 +3338,25 @@
           <w:iCs w:val="1"/>
           <w:rtl w:val="0"/>
         </w:rPr>
+        <w:t xml:space="preserve">The framework’s contribution does not depend on treating each dimension as individually unprecedented. Context use, continuity, judgment, and role adoption are already examined in different areas of AI evaluation. The proposed innovation is to represent them together as a dynamic configuration of assistant identity, allowing evaluators to record partial change, divergence between declared and enacted roles, and forms of stability that may reflect either appropriate continuity or rigidity. This provides a common modular structure for relating behavioral changes that are often evaluated separately. </w:t>
+      </w:r>
+    </w:p>
+    <w:p>
+      <w:pPr>
+        <w:spacing w:after="240" w:before="240" w:lineRule="auto"/>
+        <w:rPr>
+          <w:rFonts w:ascii="Old Standard TT" w:cs="Old Standard TT" w:eastAsia="Old Standard TT" w:hAnsi="Old Standard TT"/>
+          <w:i w:val="1"/>
+          <w:iCs w:val="1"/>
+        </w:rPr>
+      </w:pPr>
+      <w:r>
+        <w:rPr>
+          <w:rFonts w:ascii="Old Standard TT" w:cs="Old Standard TT" w:eastAsia="Old Standard TT" w:hAnsi="Old Standard TT"/>
+          <w:i w:val="1"/>
+          <w:iCs w:val="1"/>
+          <w:rtl w:val="0"/>
+        </w:rPr>
         <w:t xml:space="preserve">This view may also help identify where safety interventions are needed. Loss of substantive continuity may require better retention of relevant facts, while loss of procedural continuity may indicate weaknesses in instruction-following. Changes in contextual orientation or judgment may require interventions that preserve appropriate priorities and decision criteria under pressure. Divergence between declared and enacted self-ID may indicate that the assistant’s stated role is not reliably reflected in its behavior.</w:t>
       </w:r>
     </w:p>
@@ -3416,7 +3433,7 @@
           <w:iCs w:val="1"/>
           <w:rtl w:val="0"/>
         </w:rPr>
-        <w:t xml:space="preserve">These findings do not imply that assistants possess a unified inner self. The framework describes observable response patterns: which functions remain stable, which change, and how those changes relate.</w:t>
+        <w:t xml:space="preserve">These findings do not imply that assistants possess a unified inner self. The framework describes observable response patterns: which functions remain stable, which change, and how those changes relate. </w:t>
       </w:r>
       <w:r>
         <w:rPr>

</xml_diff>